<commit_message>
Redesign the Firmware Manager resume layout.
Add a photo header, role bars with right-aligned dates, a focus strip, and bold results while keeping the single-column structure.

Co-authored-by: Shyam <shyam.nexus@gmail.com>
</commit_message>
<xml_diff>
--- a/SKS-Resume-Firmware-Manager.docx
+++ b/SKS-Resume-Firmware-Manager.docx
@@ -2,95 +2,223 @@
 <file path=word/document.xml><?xml version="1.0" encoding="utf-8"?>
 <w:document xmlns:wpc="http://schemas.microsoft.com/office/word/2010/wordprocessingCanvas" xmlns:mo="http://schemas.microsoft.com/office/mac/office/2008/main" xmlns:mc="http://schemas.openxmlformats.org/markup-compatibility/2006" xmlns:mv="urn:schemas-microsoft-com:mac:vml" xmlns:o="urn:schemas-microsoft-com:office:office" xmlns:r="http://schemas.openxmlformats.org/officeDocument/2006/relationships" xmlns:m="http://schemas.openxmlformats.org/officeDocument/2006/math" xmlns:v="urn:schemas-microsoft-com:vml" xmlns:wp14="http://schemas.microsoft.com/office/word/2010/wordprocessingDrawing" xmlns:wp="http://schemas.openxmlformats.org/drawingml/2006/wordprocessingDrawing" xmlns:w10="urn:schemas-microsoft-com:office:word" xmlns:w="http://schemas.openxmlformats.org/wordprocessingml/2006/main" xmlns:w14="http://schemas.microsoft.com/office/word/2010/wordml" xmlns:wpg="http://schemas.microsoft.com/office/word/2010/wordprocessingGroup" xmlns:wpi="http://schemas.microsoft.com/office/word/2010/wordprocessingInk" xmlns:wne="http://schemas.microsoft.com/office/word/2006/wordml" xmlns:wps="http://schemas.microsoft.com/office/word/2010/wordprocessingShape" mc:Ignorable="w14 wp14">
   <w:body>
+    <w:tbl>
+      <w:tblPr>
+        <w:tblW w:type="dxa" w:w="10432"/>
+        <w:tblLayout w:type="fixed"/>
+        <w:tblLook w:firstColumn="1" w:firstRow="1" w:lastColumn="0" w:lastRow="0" w:noHBand="0" w:noVBand="1" w:val="04A0"/>
+        <w:tblBorders>
+          <w:top w:val="nil"/>
+          <w:left w:val="nil"/>
+          <w:bottom w:val="nil"/>
+          <w:right w:val="nil"/>
+          <w:insideH w:val="nil"/>
+          <w:insideV w:val="nil"/>
+        </w:tblBorders>
+      </w:tblPr>
+      <w:tblGrid>
+        <w:gridCol w:w="1530"/>
+        <w:gridCol w:w="8901"/>
+      </w:tblGrid>
+      <w:tr>
+        <w:tc>
+          <w:tcPr>
+            <w:tcW w:type="dxa" w:w="1530"/>
+            <w:vAlign w:val="center"/>
+            <w:tcMar>
+              <w:top w:w="0" w:type="dxa"/>
+              <w:left w:w="0" w:type="dxa"/>
+              <w:bottom w:w="0" w:type="dxa"/>
+              <w:right w:w="120" w:type="dxa"/>
+            </w:tcMar>
+          </w:tcPr>
+          <w:p>
+            <w:pPr>
+              <w:spacing w:before="0" w:after="0" w:line="240" w:lineRule="auto"/>
+            </w:pPr>
+            <w:r>
+              <w:drawing>
+                <wp:inline xmlns:a="http://schemas.openxmlformats.org/drawingml/2006/main" xmlns:pic="http://schemas.openxmlformats.org/drawingml/2006/picture">
+                  <wp:extent cx="882000" cy="882000"/>
+                  <wp:docPr id="1" name="Picture 1"/>
+                  <wp:cNvGraphicFramePr>
+                    <a:graphicFrameLocks noChangeAspect="1"/>
+                  </wp:cNvGraphicFramePr>
+                  <a:graphic>
+                    <a:graphicData uri="http://schemas.openxmlformats.org/drawingml/2006/picture">
+                      <pic:pic>
+                        <pic:nvPicPr>
+                          <pic:cNvPr id="0" name="headshot.png"/>
+                          <pic:cNvPicPr/>
+                        </pic:nvPicPr>
+                        <pic:blipFill>
+                          <a:blip r:embed="rId9"/>
+                          <a:stretch>
+                            <a:fillRect/>
+                          </a:stretch>
+                        </pic:blipFill>
+                        <pic:spPr>
+                          <a:xfrm>
+                            <a:off x="0" y="0"/>
+                            <a:ext cx="882000" cy="882000"/>
+                          </a:xfrm>
+                          <a:prstGeom prst="rect"/>
+                        </pic:spPr>
+                      </pic:pic>
+                    </a:graphicData>
+                  </a:graphic>
+                </wp:inline>
+              </w:drawing>
+            </w:r>
+          </w:p>
+        </w:tc>
+        <w:tc>
+          <w:tcPr>
+            <w:tcW w:type="dxa" w:w="8901"/>
+            <w:vAlign w:val="center"/>
+            <w:tcMar>
+              <w:top w:w="40" w:type="dxa"/>
+              <w:left w:w="80" w:type="dxa"/>
+              <w:bottom w:w="40" w:type="dxa"/>
+              <w:right w:w="0" w:type="dxa"/>
+            </w:tcMar>
+          </w:tcPr>
+          <w:p>
+            <w:pPr>
+              <w:spacing w:before="0" w:after="0" w:line="240" w:lineRule="auto"/>
+            </w:pPr>
+            <w:r>
+              <w:rPr>
+                <w:rFonts w:ascii="Calibri" w:hAnsi="Calibri" w:eastAsia="Calibri"/>
+                <w:b/>
+                <w:i w:val="0"/>
+                <w:color w:val="1B3A4B"/>
+                <w:sz w:val="40"/>
+              </w:rPr>
+              <w:t>Shyam Premkumar Shrivastava</w:t>
+            </w:r>
+          </w:p>
+          <w:p>
+            <w:pPr>
+              <w:spacing w:before="20" w:after="20" w:line="240" w:lineRule="auto"/>
+            </w:pPr>
+            <w:r>
+              <w:rPr>
+                <w:rFonts w:ascii="Calibri" w:hAnsi="Calibri" w:eastAsia="Calibri"/>
+                <w:b/>
+                <w:i w:val="0"/>
+                <w:color w:val="1F6F8B"/>
+                <w:sz w:val="24"/>
+              </w:rPr>
+              <w:t>Firmware Engineering Leader</w:t>
+            </w:r>
+          </w:p>
+          <w:p>
+            <w:pPr>
+              <w:spacing w:before="20" w:after="0" w:line="240" w:lineRule="auto"/>
+            </w:pPr>
+            <w:r>
+              <w:rPr>
+                <w:rFonts w:ascii="Calibri" w:hAnsi="Calibri" w:eastAsia="Calibri"/>
+                <w:b w:val="0"/>
+                <w:i w:val="0"/>
+                <w:color w:val="4A5866"/>
+                <w:sz w:val="20"/>
+              </w:rPr>
+              <w:t>Pune, Maharashtra</w:t>
+            </w:r>
+            <w:r>
+              <w:rPr>
+                <w:rFonts w:ascii="Calibri" w:hAnsi="Calibri" w:eastAsia="Calibri"/>
+                <w:b w:val="0"/>
+                <w:i w:val="0"/>
+                <w:color w:val="1F6F8B"/>
+                <w:sz w:val="20"/>
+              </w:rPr>
+              <w:t xml:space="preserve">   ·   </w:t>
+            </w:r>
+            <w:r>
+              <w:rPr>
+                <w:rFonts w:ascii="Calibri" w:hAnsi="Calibri" w:eastAsia="Calibri"/>
+                <w:b w:val="0"/>
+                <w:i w:val="0"/>
+                <w:color w:val="1F2933"/>
+                <w:sz w:val="20"/>
+              </w:rPr>
+              <w:t>+91 9158212310</w:t>
+            </w:r>
+            <w:r>
+              <w:rPr>
+                <w:rFonts w:ascii="Calibri" w:hAnsi="Calibri" w:eastAsia="Calibri"/>
+                <w:b w:val="0"/>
+                <w:i w:val="0"/>
+                <w:color w:val="1F6F8B"/>
+                <w:sz w:val="20"/>
+              </w:rPr>
+              <w:t xml:space="preserve">   ·   </w:t>
+            </w:r>
+            <w:r>
+              <w:rPr>
+                <w:rFonts w:ascii="Calibri" w:hAnsi="Calibri" w:eastAsia="Calibri"/>
+                <w:b w:val="0"/>
+                <w:i w:val="0"/>
+                <w:color w:val="1F2933"/>
+                <w:sz w:val="20"/>
+              </w:rPr>
+              <w:t>shyam.nexus@gmail.com</w:t>
+            </w:r>
+          </w:p>
+          <w:p>
+            <w:pPr>
+              <w:spacing w:before="0" w:after="0" w:line="240" w:lineRule="auto"/>
+            </w:pPr>
+            <w:r>
+              <w:rPr>
+                <w:rFonts w:ascii="Calibri" w:hAnsi="Calibri" w:eastAsia="Calibri"/>
+                <w:b w:val="0"/>
+                <w:i w:val="0"/>
+                <w:color w:val="1F6F8B"/>
+                <w:sz w:val="20"/>
+              </w:rPr>
+              <w:t>linkedin.com/in/shyamshrivastava</w:t>
+            </w:r>
+            <w:r>
+              <w:rPr>
+                <w:rFonts w:ascii="Calibri" w:hAnsi="Calibri" w:eastAsia="Calibri"/>
+                <w:b w:val="0"/>
+                <w:i w:val="0"/>
+                <w:color w:val="4A5866"/>
+                <w:sz w:val="20"/>
+              </w:rPr>
+              <w:t xml:space="preserve">   ·   </w:t>
+            </w:r>
+            <w:r>
+              <w:rPr>
+                <w:rFonts w:ascii="Calibri" w:hAnsi="Calibri" w:eastAsia="Calibri"/>
+                <w:b w:val="0"/>
+                <w:i w:val="0"/>
+                <w:color w:val="1F6F8B"/>
+                <w:sz w:val="20"/>
+              </w:rPr>
+              <w:t>shyamshrivastava.com</w:t>
+            </w:r>
+          </w:p>
+        </w:tc>
+      </w:tr>
+    </w:tbl>
     <w:p>
       <w:pPr>
-        <w:spacing w:before="0" w:after="0" w:line="240" w:lineRule="auto"/>
-        <w:jc w:val="center"/>
+        <w:spacing w:before="60" w:after="20" w:line="240" w:lineRule="auto"/>
+        <w:pBdr>
+          <w:bottom w:val="single" w:sz="16" w:space="1" w:color="1B3A4B"/>
+        </w:pBdr>
       </w:pPr>
-      <w:r>
-        <w:rPr>
-          <w:rFonts w:ascii="Calibri" w:hAnsi="Calibri" w:eastAsia="Calibri"/>
-          <w:b/>
-          <w:i w:val="0"/>
-          <w:color w:val="1B3A4B"/>
-          <w:sz w:val="36"/>
-        </w:rPr>
-        <w:t>SHYAM PREMKUMAR SHRIVASTAVA</w:t>
-      </w:r>
     </w:p>
     <w:p>
       <w:pPr>
-        <w:spacing w:before="20" w:after="20" w:line="240" w:lineRule="auto"/>
-        <w:jc w:val="center"/>
-      </w:pPr>
-      <w:r>
-        <w:rPr>
-          <w:rFonts w:ascii="Calibri" w:hAnsi="Calibri" w:eastAsia="Calibri"/>
-          <w:b/>
-          <w:i w:val="0"/>
-          <w:color w:val="1F6F8B"/>
-          <w:sz w:val="22"/>
-        </w:rPr>
-        <w:t>Firmware Engineering Leader  ·  Connected Products  ·  Team Delivery</w:t>
-      </w:r>
-    </w:p>
-    <w:p>
-      <w:pPr>
-        <w:spacing w:before="0" w:after="0" w:line="240" w:lineRule="auto"/>
-        <w:jc w:val="center"/>
-      </w:pPr>
-      <w:r>
-        <w:rPr>
-          <w:rFonts w:ascii="Calibri" w:hAnsi="Calibri" w:eastAsia="Calibri"/>
-          <w:b w:val="0"/>
-          <w:i w:val="0"/>
-          <w:color w:val="3D4A57"/>
-          <w:sz w:val="20"/>
-        </w:rPr>
-        <w:t>Pune, Maharashtra  ·  +91 9158212310  ·  shyam.nexus@gmail.com</w:t>
-      </w:r>
-    </w:p>
-    <w:p>
-      <w:pPr>
-        <w:spacing w:before="0" w:after="20" w:line="240" w:lineRule="auto"/>
-        <w:jc w:val="center"/>
-      </w:pPr>
-      <w:r>
-        <w:rPr>
-          <w:rFonts w:ascii="Calibri" w:hAnsi="Calibri" w:eastAsia="Calibri"/>
-          <w:b w:val="0"/>
-          <w:i w:val="0"/>
-          <w:color w:val="1F6F8B"/>
-          <w:sz w:val="20"/>
-        </w:rPr>
-        <w:t>linkedin.com/in/shyamshrivastava</w:t>
-      </w:r>
-      <w:r>
-        <w:rPr>
-          <w:rFonts w:ascii="Calibri" w:hAnsi="Calibri" w:eastAsia="Calibri"/>
-          <w:b w:val="0"/>
-          <w:i w:val="0"/>
-          <w:color w:val="3D4A57"/>
-          <w:sz w:val="20"/>
-        </w:rPr>
-        <w:t xml:space="preserve">   ·   </w:t>
-      </w:r>
-      <w:r>
-        <w:rPr>
-          <w:rFonts w:ascii="Calibri" w:hAnsi="Calibri" w:eastAsia="Calibri"/>
-          <w:b w:val="0"/>
-          <w:i w:val="0"/>
-          <w:color w:val="1F6F8B"/>
-          <w:sz w:val="20"/>
-        </w:rPr>
-        <w:t>shyamshrivastava.com</w:t>
-      </w:r>
-    </w:p>
-    <w:p>
-      <w:pPr>
-        <w:spacing w:before="120" w:after="40" w:line="240" w:lineRule="auto"/>
+        <w:spacing w:before="160" w:after="40" w:line="240" w:lineRule="auto"/>
         <w:pBdr>
-          <w:bottom w:val="single" w:sz="8" w:space="1" w:color="1F6F8B"/>
+          <w:bottom w:val="single" w:sz="12" w:space="1" w:color="1B3A4B"/>
         </w:pBdr>
       </w:pPr>
       <w:r>
@@ -99,14 +227,14 @@
           <w:b/>
           <w:i w:val="0"/>
           <w:color w:val="1B3A4B"/>
-          <w:sz w:val="23"/>
+          <w:sz w:val="22"/>
         </w:rPr>
         <w:t>PROFESSIONAL SUMMARY</w:t>
       </w:r>
     </w:p>
     <w:p>
       <w:pPr>
-        <w:spacing w:before="0" w:after="20" w:line="252" w:lineRule="auto"/>
+        <w:spacing w:before="20" w:after="40" w:line="254" w:lineRule="auto"/>
       </w:pPr>
       <w:r>
         <w:rPr>
@@ -116,31 +244,8 @@
           <w:color w:val="1F2933"/>
           <w:sz w:val="21"/>
         </w:rPr>
-        <w:t>Firmware engineering leader with 19+ years taking connected products from architecture to release. At Honeywell in Pune, leads a 12-member cross-functional team across surveillance, fire safety, and wearable platforms: firmware roadmap, design reviews, Scrum delivery, secure boot and OTA, and STQC/BIS certification. Hands-on in Embedded C/C++, FreeRTOS, ARM Cortex-M/A, device drivers, bootloaders, and UART, SPI, I2C, CAN, USB, Ethernet, BLE, Wi-Fi, MQTT, and TCP/IP.</w:t>
+        <w:t xml:space="preserve">Firmware engineering leader with </w:t>
       </w:r>
-    </w:p>
-    <w:p>
-      <w:pPr>
-        <w:spacing w:before="120" w:after="40" w:line="240" w:lineRule="auto"/>
-        <w:pBdr>
-          <w:bottom w:val="single" w:sz="8" w:space="1" w:color="1F6F8B"/>
-        </w:pBdr>
-      </w:pPr>
-      <w:r>
-        <w:rPr>
-          <w:rFonts w:ascii="Calibri" w:hAnsi="Calibri" w:eastAsia="Calibri"/>
-          <w:b/>
-          <w:i w:val="0"/>
-          <w:color w:val="1B3A4B"/>
-          <w:sz w:val="23"/>
-        </w:rPr>
-        <w:t>LEADERSHIP FOCUS</w:t>
-      </w:r>
-    </w:p>
-    <w:p>
-      <w:pPr>
-        <w:spacing w:before="0" w:after="20" w:line="245" w:lineRule="auto"/>
-      </w:pPr>
       <w:r>
         <w:rPr>
           <w:rFonts w:ascii="Calibri" w:hAnsi="Calibri" w:eastAsia="Calibri"/>
@@ -149,7 +254,7 @@
           <w:color w:val="1B3A4B"/>
           <w:sz w:val="21"/>
         </w:rPr>
-        <w:t xml:space="preserve">Technical leadership.  </w:t>
+        <w:t>19+ years</w:t>
       </w:r>
       <w:r>
         <w:rPr>
@@ -159,13 +264,8 @@
           <w:color w:val="1F2933"/>
           <w:sz w:val="21"/>
         </w:rPr>
-        <w:t>Firmware roadmap, architecture decisions, design reviews, coding standards, and system-level root-cause analysis.</w:t>
+        <w:t xml:space="preserve"> taking connected products from architecture to release. At Honeywell in Pune, leads a </w:t>
       </w:r>
-    </w:p>
-    <w:p>
-      <w:pPr>
-        <w:spacing w:before="0" w:after="20" w:line="245" w:lineRule="auto"/>
-      </w:pPr>
       <w:r>
         <w:rPr>
           <w:rFonts w:ascii="Calibri" w:hAnsi="Calibri" w:eastAsia="Calibri"/>
@@ -174,7 +274,7 @@
           <w:color w:val="1B3A4B"/>
           <w:sz w:val="21"/>
         </w:rPr>
-        <w:t xml:space="preserve">Program delivery.  </w:t>
+        <w:t>12-member</w:t>
       </w:r>
       <w:r>
         <w:rPr>
@@ -184,89 +284,16 @@
           <w:color w:val="1F2933"/>
           <w:sz w:val="21"/>
         </w:rPr>
-        <w:t>Several firmware programs in parallel, with quality, cost, schedule, release gates, and executive status reporting.</w:t>
+        <w:t xml:space="preserve"> cross-functional team across surveillance, fire safety, and wearable platforms: firmware roadmap, design reviews, Scrum delivery, secure boot and OTA, and STQC/BIS certification. Hands-on in Embedded C/C++, FreeRTOS, ARM Cortex-M/A, device drivers, bootloaders, and UART, SPI, I2C, CAN, USB, Ethernet, BLE, Wi-Fi, MQTT, and TCP/IP.</w:t>
       </w:r>
     </w:p>
     <w:p>
       <w:pPr>
-        <w:spacing w:before="0" w:after="20" w:line="245" w:lineRule="auto"/>
-      </w:pPr>
-      <w:r>
-        <w:rPr>
-          <w:rFonts w:ascii="Calibri" w:hAnsi="Calibri" w:eastAsia="Calibri"/>
-          <w:b/>
-          <w:i w:val="0"/>
-          <w:color w:val="1B3A4B"/>
-          <w:sz w:val="21"/>
-        </w:rPr>
-        <w:t xml:space="preserve">Team leadership.  </w:t>
-      </w:r>
-      <w:r>
-        <w:rPr>
-          <w:rFonts w:ascii="Calibri" w:hAnsi="Calibri" w:eastAsia="Calibri"/>
-          <w:b w:val="0"/>
-          <w:i w:val="0"/>
-          <w:color w:val="1F2933"/>
-          <w:sz w:val="21"/>
-        </w:rPr>
-        <w:t>People management for a 12-member team, mentoring, performance reviews, task delegation, and hiring support for C, C++, and Linux firmware roles.</w:t>
-      </w:r>
-    </w:p>
-    <w:p>
-      <w:pPr>
-        <w:spacing w:before="0" w:after="20" w:line="245" w:lineRule="auto"/>
-      </w:pPr>
-      <w:r>
-        <w:rPr>
-          <w:rFonts w:ascii="Calibri" w:hAnsi="Calibri" w:eastAsia="Calibri"/>
-          <w:b/>
-          <w:i w:val="0"/>
-          <w:color w:val="1B3A4B"/>
-          <w:sz w:val="21"/>
-        </w:rPr>
-        <w:t xml:space="preserve">Cross-functional work.  </w:t>
-      </w:r>
-      <w:r>
-        <w:rPr>
-          <w:rFonts w:ascii="Calibri" w:hAnsi="Calibri" w:eastAsia="Calibri"/>
-          <w:b w:val="0"/>
-          <w:i w:val="0"/>
-          <w:color w:val="1F2933"/>
-          <w:sz w:val="21"/>
-        </w:rPr>
-        <w:t>Hardware, cloud, mobile connectivity, QA, security, manufacturing, and product stakeholders, including global customers.</w:t>
-      </w:r>
-    </w:p>
-    <w:p>
-      <w:pPr>
-        <w:spacing w:before="0" w:after="20" w:line="245" w:lineRule="auto"/>
-      </w:pPr>
-      <w:r>
-        <w:rPr>
-          <w:rFonts w:ascii="Calibri" w:hAnsi="Calibri" w:eastAsia="Calibri"/>
-          <w:b/>
-          <w:i w:val="0"/>
-          <w:color w:val="1B3A4B"/>
-          <w:sz w:val="21"/>
-        </w:rPr>
-        <w:t xml:space="preserve">Quality and security.  </w:t>
-      </w:r>
-      <w:r>
-        <w:rPr>
-          <w:rFonts w:ascii="Calibri" w:hAnsi="Calibri" w:eastAsia="Calibri"/>
-          <w:b w:val="0"/>
-          <w:i w:val="0"/>
-          <w:color w:val="1F2933"/>
-          <w:sz w:val="21"/>
-        </w:rPr>
-        <w:t>DFMEA, engineering metrics, Dev-to-QA entry criteria, cybersecurity workflows, and regulatory compliance.</w:t>
-      </w:r>
-    </w:p>
-    <w:p>
-      <w:pPr>
-        <w:spacing w:before="120" w:after="40" w:line="240" w:lineRule="auto"/>
+        <w:spacing w:before="40" w:after="20" w:line="259" w:lineRule="auto"/>
+        <w:ind w:left="68" w:right="45"/>
+        <w:shd w:val="clear" w:color="auto" w:fill="F4F8F9"/>
         <w:pBdr>
-          <w:bottom w:val="single" w:sz="8" w:space="1" w:color="1F6F8B"/>
+          <w:left w:val="single" w:sz="16" w:space="6" w:color="1F6F8B"/>
         </w:pBdr>
       </w:pPr>
       <w:r>
@@ -275,14 +302,45 @@
           <w:b/>
           <w:i w:val="0"/>
           <w:color w:val="1B3A4B"/>
-          <w:sz w:val="23"/>
+          <w:sz w:val="19"/>
+        </w:rPr>
+        <w:t>Roadmap and architecture   ·   Multi-program delivery   ·   Team of 12</w:t>
+      </w:r>
+      <w:r>
+        <w:br/>
+      </w:r>
+      <w:r>
+        <w:rPr>
+          <w:rFonts w:ascii="Calibri" w:hAnsi="Calibri" w:eastAsia="Calibri"/>
+          <w:b/>
+          <w:i w:val="0"/>
+          <w:color w:val="1B3A4B"/>
+          <w:sz w:val="19"/>
+        </w:rPr>
+        <w:t>Hardware, cloud, QA, manufacturing   ·   DFMEA, cybersecurity, STQC/BIS</w:t>
+      </w:r>
+    </w:p>
+    <w:p>
+      <w:pPr>
+        <w:spacing w:before="160" w:after="40" w:line="240" w:lineRule="auto"/>
+        <w:pBdr>
+          <w:bottom w:val="single" w:sz="12" w:space="1" w:color="1B3A4B"/>
+        </w:pBdr>
+      </w:pPr>
+      <w:r>
+        <w:rPr>
+          <w:rFonts w:ascii="Calibri" w:hAnsi="Calibri" w:eastAsia="Calibri"/>
+          <w:b/>
+          <w:i w:val="0"/>
+          <w:color w:val="1B3A4B"/>
+          <w:sz w:val="22"/>
         </w:rPr>
         <w:t>TECHNICAL EXPERTISE</w:t>
       </w:r>
     </w:p>
     <w:p>
       <w:pPr>
-        <w:spacing w:before="0" w:after="20" w:line="245" w:lineRule="auto"/>
+        <w:spacing w:before="0" w:after="12" w:line="245" w:lineRule="auto"/>
       </w:pPr>
       <w:r>
         <w:rPr>
@@ -307,7 +365,7 @@
     </w:p>
     <w:p>
       <w:pPr>
-        <w:spacing w:before="0" w:after="20" w:line="245" w:lineRule="auto"/>
+        <w:spacing w:before="0" w:after="12" w:line="245" w:lineRule="auto"/>
       </w:pPr>
       <w:r>
         <w:rPr>
@@ -332,7 +390,7 @@
     </w:p>
     <w:p>
       <w:pPr>
-        <w:spacing w:before="0" w:after="20" w:line="245" w:lineRule="auto"/>
+        <w:spacing w:before="0" w:after="12" w:line="245" w:lineRule="auto"/>
       </w:pPr>
       <w:r>
         <w:rPr>
@@ -357,7 +415,7 @@
     </w:p>
     <w:p>
       <w:pPr>
-        <w:spacing w:before="0" w:after="20" w:line="245" w:lineRule="auto"/>
+        <w:spacing w:before="0" w:after="12" w:line="245" w:lineRule="auto"/>
       </w:pPr>
       <w:r>
         <w:rPr>
@@ -382,7 +440,7 @@
     </w:p>
     <w:p>
       <w:pPr>
-        <w:spacing w:before="0" w:after="20" w:line="245" w:lineRule="auto"/>
+        <w:spacing w:before="0" w:after="12" w:line="245" w:lineRule="auto"/>
       </w:pPr>
       <w:r>
         <w:rPr>
@@ -407,7 +465,7 @@
     </w:p>
     <w:p>
       <w:pPr>
-        <w:spacing w:before="0" w:after="20" w:line="245" w:lineRule="auto"/>
+        <w:spacing w:before="0" w:after="12" w:line="245" w:lineRule="auto"/>
       </w:pPr>
       <w:r>
         <w:rPr>
@@ -432,7 +490,7 @@
     </w:p>
     <w:p>
       <w:pPr>
-        <w:spacing w:before="0" w:after="20" w:line="245" w:lineRule="auto"/>
+        <w:spacing w:before="0" w:after="12" w:line="245" w:lineRule="auto"/>
       </w:pPr>
       <w:r>
         <w:rPr>
@@ -457,9 +515,9 @@
     </w:p>
     <w:p>
       <w:pPr>
-        <w:spacing w:before="120" w:after="40" w:line="240" w:lineRule="auto"/>
+        <w:spacing w:before="160" w:after="40" w:line="240" w:lineRule="auto"/>
         <w:pBdr>
-          <w:bottom w:val="single" w:sz="8" w:space="1" w:color="1F6F8B"/>
+          <w:bottom w:val="single" w:sz="12" w:space="1" w:color="1B3A4B"/>
         </w:pBdr>
       </w:pPr>
       <w:r>
@@ -468,14 +526,22 @@
           <w:b/>
           <w:i w:val="0"/>
           <w:color w:val="1B3A4B"/>
-          <w:sz w:val="23"/>
+          <w:sz w:val="22"/>
         </w:rPr>
         <w:t>EXPERIENCE</w:t>
       </w:r>
     </w:p>
     <w:p>
       <w:pPr>
-        <w:spacing w:before="100" w:after="0" w:line="240" w:lineRule="auto"/>
+        <w:tabs>
+          <w:tab w:pos="10346" w:val="right"/>
+        </w:tabs>
+        <w:spacing w:before="140" w:after="0" w:line="240" w:lineRule="auto"/>
+        <w:ind w:left="68" w:right="28"/>
+        <w:shd w:val="clear" w:color="auto" w:fill="E7F2F5"/>
+        <w:pBdr>
+          <w:left w:val="single" w:sz="20" w:space="5" w:color="1B3A4B"/>
+        </w:pBdr>
       </w:pPr>
       <w:r>
         <w:rPr>
@@ -483,7 +549,7 @@
           <w:b/>
           <w:i w:val="0"/>
           <w:color w:val="1B3A4B"/>
-          <w:sz w:val="23"/>
+          <w:sz w:val="22"/>
         </w:rPr>
         <w:t>Project Lead / Sr. Advanced Engineer</w:t>
       </w:r>
@@ -492,10 +558,10 @@
           <w:rFonts w:ascii="Calibri" w:hAnsi="Calibri" w:eastAsia="Calibri"/>
           <w:b w:val="0"/>
           <w:i w:val="0"/>
-          <w:color w:val="1F6F8B"/>
-          <w:sz w:val="21"/>
+          <w:color w:val="1F2933"/>
+          <w:sz w:val="20"/>
         </w:rPr>
-        <w:t xml:space="preserve">   |   </w:t>
+        <w:tab/>
       </w:r>
       <w:r>
         <w:rPr>
@@ -503,29 +569,30 @@
           <w:b/>
           <w:i w:val="0"/>
           <w:color w:val="1F6F8B"/>
-          <w:sz w:val="21"/>
+          <w:sz w:val="20"/>
         </w:rPr>
         <w:t>Feb 2024 – Present</w:t>
       </w:r>
     </w:p>
     <w:p>
       <w:pPr>
-        <w:spacing w:before="0" w:after="40" w:line="240" w:lineRule="auto"/>
+        <w:spacing w:before="20" w:after="20" w:line="240" w:lineRule="auto"/>
+        <w:ind w:left="68"/>
       </w:pPr>
       <w:r>
         <w:rPr>
           <w:rFonts w:ascii="Calibri" w:hAnsi="Calibri" w:eastAsia="Calibri"/>
           <w:b w:val="0"/>
           <w:i/>
-          <w:color w:val="3D4A57"/>
-          <w:sz w:val="21"/>
+          <w:color w:val="4A5866"/>
+          <w:sz w:val="20"/>
         </w:rPr>
         <w:t>Honeywell Technologies (HIIPL), Pune</w:t>
       </w:r>
     </w:p>
     <w:p>
       <w:pPr>
-        <w:spacing w:before="0" w:after="40" w:line="252" w:lineRule="auto"/>
+        <w:spacing w:before="20" w:after="20" w:line="254" w:lineRule="auto"/>
       </w:pPr>
       <w:r>
         <w:rPr>
@@ -540,8 +607,8 @@
     </w:p>
     <w:p>
       <w:pPr>
-        <w:spacing w:before="0" w:after="16" w:line="245" w:lineRule="auto"/>
-        <w:ind w:left="198" w:hanging="198"/>
+        <w:spacing w:before="8" w:after="20" w:line="250" w:lineRule="auto"/>
+        <w:ind w:left="215" w:hanging="215"/>
       </w:pPr>
       <w:r>
         <w:rPr>
@@ -549,9 +616,9 @@
           <w:b/>
           <w:i w:val="0"/>
           <w:color w:val="1F6F8B"/>
-          <w:sz w:val="21"/>
+          <w:sz w:val="20"/>
         </w:rPr>
-        <w:t xml:space="preserve">•  </w:t>
+        <w:t xml:space="preserve">▸  </w:t>
       </w:r>
       <w:r>
         <w:rPr>
@@ -561,13 +628,53 @@
           <w:color w:val="1F2933"/>
           <w:sz w:val="21"/>
         </w:rPr>
-        <w:t>Lead a 12-member cross-functional engineering team. Own performance reviews for 6 engineers and mentor subsystem leads across firmware, Linux BSP, and validation.</w:t>
+        <w:t xml:space="preserve">Lead a </w:t>
+      </w:r>
+      <w:r>
+        <w:rPr>
+          <w:rFonts w:ascii="Calibri" w:hAnsi="Calibri" w:eastAsia="Calibri"/>
+          <w:b/>
+          <w:i w:val="0"/>
+          <w:color w:val="1B3A4B"/>
+          <w:sz w:val="21"/>
+        </w:rPr>
+        <w:t>12-member</w:t>
+      </w:r>
+      <w:r>
+        <w:rPr>
+          <w:rFonts w:ascii="Calibri" w:hAnsi="Calibri" w:eastAsia="Calibri"/>
+          <w:b w:val="0"/>
+          <w:i w:val="0"/>
+          <w:color w:val="1F2933"/>
+          <w:sz w:val="21"/>
+        </w:rPr>
+        <w:t xml:space="preserve"> cross-functional engineering team. Own performance reviews for </w:t>
+      </w:r>
+      <w:r>
+        <w:rPr>
+          <w:rFonts w:ascii="Calibri" w:hAnsi="Calibri" w:eastAsia="Calibri"/>
+          <w:b/>
+          <w:i w:val="0"/>
+          <w:color w:val="1B3A4B"/>
+          <w:sz w:val="21"/>
+        </w:rPr>
+        <w:t>6 engineers</w:t>
+      </w:r>
+      <w:r>
+        <w:rPr>
+          <w:rFonts w:ascii="Calibri" w:hAnsi="Calibri" w:eastAsia="Calibri"/>
+          <w:b w:val="0"/>
+          <w:i w:val="0"/>
+          <w:color w:val="1F2933"/>
+          <w:sz w:val="21"/>
+        </w:rPr>
+        <w:t xml:space="preserve"> and mentor subsystem leads across firmware, Linux BSP, and validation.</w:t>
       </w:r>
     </w:p>
     <w:p>
       <w:pPr>
-        <w:spacing w:before="0" w:after="16" w:line="245" w:lineRule="auto"/>
-        <w:ind w:left="198" w:hanging="198"/>
+        <w:spacing w:before="8" w:after="20" w:line="250" w:lineRule="auto"/>
+        <w:ind w:left="215" w:hanging="215"/>
       </w:pPr>
       <w:r>
         <w:rPr>
@@ -575,9 +682,9 @@
           <w:b/>
           <w:i w:val="0"/>
           <w:color w:val="1F6F8B"/>
-          <w:sz w:val="21"/>
+          <w:sz w:val="20"/>
         </w:rPr>
-        <w:t xml:space="preserve">•  </w:t>
+        <w:t xml:space="preserve">▸  </w:t>
       </w:r>
       <w:r>
         <w:rPr>
@@ -592,8 +699,8 @@
     </w:p>
     <w:p>
       <w:pPr>
-        <w:spacing w:before="0" w:after="16" w:line="245" w:lineRule="auto"/>
-        <w:ind w:left="198" w:hanging="198"/>
+        <w:spacing w:before="8" w:after="20" w:line="250" w:lineRule="auto"/>
+        <w:ind w:left="215" w:hanging="215"/>
       </w:pPr>
       <w:r>
         <w:rPr>
@@ -601,9 +708,9 @@
           <w:b/>
           <w:i w:val="0"/>
           <w:color w:val="1F6F8B"/>
-          <w:sz w:val="21"/>
+          <w:sz w:val="20"/>
         </w:rPr>
-        <w:t xml:space="preserve">•  </w:t>
+        <w:t xml:space="preserve">▸  </w:t>
       </w:r>
       <w:r>
         <w:rPr>
@@ -613,23 +720,17 @@
           <w:color w:val="1F2933"/>
           <w:sz w:val="21"/>
         </w:rPr>
-        <w:t>Set design-review and release discipline with Dev-to-QA entry criteria, checklist-driven validation, and tighter control of what qualifies as a build. Vulnerability remediation cycle time fell by about 35%, with schedule adherence above 95%.</w:t>
+        <w:t xml:space="preserve">Set design-review and release discipline with Dev-to-QA entry criteria, checklist-driven validation, and tighter control of what qualifies as a build. Vulnerability remediation cycle time fell by about </w:t>
       </w:r>
-    </w:p>
-    <w:p>
-      <w:pPr>
-        <w:spacing w:before="0" w:after="16" w:line="245" w:lineRule="auto"/>
-        <w:ind w:left="198" w:hanging="198"/>
-      </w:pPr>
       <w:r>
         <w:rPr>
           <w:rFonts w:ascii="Calibri" w:hAnsi="Calibri" w:eastAsia="Calibri"/>
           <w:b/>
           <w:i w:val="0"/>
-          <w:color w:val="1F6F8B"/>
+          <w:color w:val="1B3A4B"/>
           <w:sz w:val="21"/>
         </w:rPr>
-        <w:t xml:space="preserve">•  </w:t>
+        <w:t>35%</w:t>
       </w:r>
       <w:r>
         <w:rPr>
@@ -639,23 +740,17 @@
           <w:color w:val="1F2933"/>
           <w:sz w:val="21"/>
         </w:rPr>
-        <w:t>Own STQC and BIS certification for the security-camera portfolio, including secure-boot evidence and vulnerability closure, with zero critical audit rejections.</w:t>
+        <w:t xml:space="preserve">, with schedule adherence above </w:t>
       </w:r>
-    </w:p>
-    <w:p>
-      <w:pPr>
-        <w:spacing w:before="0" w:after="16" w:line="245" w:lineRule="auto"/>
-        <w:ind w:left="198" w:hanging="198"/>
-      </w:pPr>
       <w:r>
         <w:rPr>
           <w:rFonts w:ascii="Calibri" w:hAnsi="Calibri" w:eastAsia="Calibri"/>
           <w:b/>
           <w:i w:val="0"/>
-          <w:color w:val="1F6F8B"/>
+          <w:color w:val="1B3A4B"/>
           <w:sz w:val="21"/>
         </w:rPr>
-        <w:t xml:space="preserve">•  </w:t>
+        <w:t>95%</w:t>
       </w:r>
       <w:r>
         <w:rPr>
@@ -665,13 +760,13 @@
           <w:color w:val="1F2933"/>
           <w:sz w:val="21"/>
         </w:rPr>
-        <w:t>Led the cost-optimized fire-alarm panel on an STM32 MCU running an RTOS. DFMEA plus schematic and firmware review kept alarm, supervision, watchdog, and manufacturing diagnostics intact while reducing BOM cost by about 10–15% and improving early defect detection by about 25%.</w:t>
+        <w:t>.</w:t>
       </w:r>
     </w:p>
     <w:p>
       <w:pPr>
-        <w:spacing w:before="0" w:after="16" w:line="245" w:lineRule="auto"/>
-        <w:ind w:left="198" w:hanging="198"/>
+        <w:spacing w:before="8" w:after="20" w:line="250" w:lineRule="auto"/>
+        <w:ind w:left="215" w:hanging="215"/>
       </w:pPr>
       <w:r>
         <w:rPr>
@@ -679,9 +774,9 @@
           <w:b/>
           <w:i w:val="0"/>
           <w:color w:val="1F6F8B"/>
-          <w:sz w:val="21"/>
+          <w:sz w:val="20"/>
         </w:rPr>
-        <w:t xml:space="preserve">•  </w:t>
+        <w:t xml:space="preserve">▸  </w:t>
       </w:r>
       <w:r>
         <w:rPr>
@@ -691,13 +786,33 @@
           <w:color w:val="1F2933"/>
           <w:sz w:val="21"/>
         </w:rPr>
-        <w:t>Guide the wearable smart-patch firmware on ESP32-S3 and ESP-IDF, covering ECG, SpO2, and temperature, BLE and Wi-Fi, MQTT/TCP-IP sync, local store-and-forward, and power budgets that improved efficiency by about 20%.</w:t>
+        <w:t xml:space="preserve">Own STQC and BIS certification for the security-camera portfolio, including secure-boot evidence and vulnerability closure, with </w:t>
+      </w:r>
+      <w:r>
+        <w:rPr>
+          <w:rFonts w:ascii="Calibri" w:hAnsi="Calibri" w:eastAsia="Calibri"/>
+          <w:b/>
+          <w:i w:val="0"/>
+          <w:color w:val="1B3A4B"/>
+          <w:sz w:val="21"/>
+        </w:rPr>
+        <w:t>zero critical audit rejections</w:t>
+      </w:r>
+      <w:r>
+        <w:rPr>
+          <w:rFonts w:ascii="Calibri" w:hAnsi="Calibri" w:eastAsia="Calibri"/>
+          <w:b w:val="0"/>
+          <w:i w:val="0"/>
+          <w:color w:val="1F2933"/>
+          <w:sz w:val="21"/>
+        </w:rPr>
+        <w:t>.</w:t>
       </w:r>
     </w:p>
     <w:p>
       <w:pPr>
-        <w:spacing w:before="0" w:after="16" w:line="245" w:lineRule="auto"/>
-        <w:ind w:left="198" w:hanging="198"/>
+        <w:spacing w:before="8" w:after="20" w:line="250" w:lineRule="auto"/>
+        <w:ind w:left="215" w:hanging="215"/>
       </w:pPr>
       <w:r>
         <w:rPr>
@@ -705,9 +820,121 @@
           <w:b/>
           <w:i w:val="0"/>
           <w:color w:val="1F6F8B"/>
+          <w:sz w:val="20"/>
+        </w:rPr>
+        <w:t xml:space="preserve">▸  </w:t>
+      </w:r>
+      <w:r>
+        <w:rPr>
+          <w:rFonts w:ascii="Calibri" w:hAnsi="Calibri" w:eastAsia="Calibri"/>
+          <w:b w:val="0"/>
+          <w:i w:val="0"/>
+          <w:color w:val="1F2933"/>
           <w:sz w:val="21"/>
         </w:rPr>
-        <w:t xml:space="preserve">•  </w:t>
+        <w:t xml:space="preserve">Led the cost-optimized fire-alarm panel on an STM32 MCU running an RTOS. DFMEA plus schematic and firmware review kept alarm, supervision, watchdog, and manufacturing diagnostics intact while reducing BOM cost by about </w:t>
+      </w:r>
+      <w:r>
+        <w:rPr>
+          <w:rFonts w:ascii="Calibri" w:hAnsi="Calibri" w:eastAsia="Calibri"/>
+          <w:b/>
+          <w:i w:val="0"/>
+          <w:color w:val="1B3A4B"/>
+          <w:sz w:val="21"/>
+        </w:rPr>
+        <w:t>10–15%</w:t>
+      </w:r>
+      <w:r>
+        <w:rPr>
+          <w:rFonts w:ascii="Calibri" w:hAnsi="Calibri" w:eastAsia="Calibri"/>
+          <w:b w:val="0"/>
+          <w:i w:val="0"/>
+          <w:color w:val="1F2933"/>
+          <w:sz w:val="21"/>
+        </w:rPr>
+        <w:t xml:space="preserve"> and improving early defect detection by about </w:t>
+      </w:r>
+      <w:r>
+        <w:rPr>
+          <w:rFonts w:ascii="Calibri" w:hAnsi="Calibri" w:eastAsia="Calibri"/>
+          <w:b/>
+          <w:i w:val="0"/>
+          <w:color w:val="1B3A4B"/>
+          <w:sz w:val="21"/>
+        </w:rPr>
+        <w:t>25%</w:t>
+      </w:r>
+      <w:r>
+        <w:rPr>
+          <w:rFonts w:ascii="Calibri" w:hAnsi="Calibri" w:eastAsia="Calibri"/>
+          <w:b w:val="0"/>
+          <w:i w:val="0"/>
+          <w:color w:val="1F2933"/>
+          <w:sz w:val="21"/>
+        </w:rPr>
+        <w:t>.</w:t>
+      </w:r>
+    </w:p>
+    <w:p>
+      <w:pPr>
+        <w:spacing w:before="8" w:after="20" w:line="250" w:lineRule="auto"/>
+        <w:ind w:left="215" w:hanging="215"/>
+      </w:pPr>
+      <w:r>
+        <w:rPr>
+          <w:rFonts w:ascii="Calibri" w:hAnsi="Calibri" w:eastAsia="Calibri"/>
+          <w:b/>
+          <w:i w:val="0"/>
+          <w:color w:val="1F6F8B"/>
+          <w:sz w:val="20"/>
+        </w:rPr>
+        <w:t xml:space="preserve">▸  </w:t>
+      </w:r>
+      <w:r>
+        <w:rPr>
+          <w:rFonts w:ascii="Calibri" w:hAnsi="Calibri" w:eastAsia="Calibri"/>
+          <w:b w:val="0"/>
+          <w:i w:val="0"/>
+          <w:color w:val="1F2933"/>
+          <w:sz w:val="21"/>
+        </w:rPr>
+        <w:t xml:space="preserve">Guide the wearable smart-patch firmware on ESP32-S3 and ESP-IDF, covering ECG, SpO2, and temperature, BLE and Wi-Fi, MQTT/TCP-IP sync, local store-and-forward, and power budgets that improved efficiency by about </w:t>
+      </w:r>
+      <w:r>
+        <w:rPr>
+          <w:rFonts w:ascii="Calibri" w:hAnsi="Calibri" w:eastAsia="Calibri"/>
+          <w:b/>
+          <w:i w:val="0"/>
+          <w:color w:val="1B3A4B"/>
+          <w:sz w:val="21"/>
+        </w:rPr>
+        <w:t>20%</w:t>
+      </w:r>
+      <w:r>
+        <w:rPr>
+          <w:rFonts w:ascii="Calibri" w:hAnsi="Calibri" w:eastAsia="Calibri"/>
+          <w:b w:val="0"/>
+          <w:i w:val="0"/>
+          <w:color w:val="1F2933"/>
+          <w:sz w:val="21"/>
+        </w:rPr>
+        <w:t>.</w:t>
+      </w:r>
+    </w:p>
+    <w:p>
+      <w:pPr>
+        <w:spacing w:before="8" w:after="20" w:line="250" w:lineRule="auto"/>
+        <w:ind w:left="215" w:hanging="215"/>
+      </w:pPr>
+      <w:r>
+        <w:rPr>
+          <w:rFonts w:ascii="Calibri" w:hAnsi="Calibri" w:eastAsia="Calibri"/>
+          <w:b/>
+          <w:i w:val="0"/>
+          <w:color w:val="1F6F8B"/>
+          <w:sz w:val="20"/>
+        </w:rPr>
+        <w:t xml:space="preserve">▸  </w:t>
       </w:r>
       <w:r>
         <w:rPr>
@@ -722,7 +949,15 @@
     </w:p>
     <w:p>
       <w:pPr>
-        <w:spacing w:before="100" w:after="0" w:line="240" w:lineRule="auto"/>
+        <w:tabs>
+          <w:tab w:pos="10346" w:val="right"/>
+        </w:tabs>
+        <w:spacing w:before="140" w:after="0" w:line="240" w:lineRule="auto"/>
+        <w:ind w:left="68" w:right="28"/>
+        <w:shd w:val="clear" w:color="auto" w:fill="E7F2F5"/>
+        <w:pBdr>
+          <w:left w:val="single" w:sz="20" w:space="5" w:color="1B3A4B"/>
+        </w:pBdr>
       </w:pPr>
       <w:r>
         <w:rPr>
@@ -730,7 +965,7 @@
           <w:b/>
           <w:i w:val="0"/>
           <w:color w:val="1B3A4B"/>
-          <w:sz w:val="23"/>
+          <w:sz w:val="22"/>
         </w:rPr>
         <w:t>Technical Manager</w:t>
       </w:r>
@@ -739,10 +974,10 @@
           <w:rFonts w:ascii="Calibri" w:hAnsi="Calibri" w:eastAsia="Calibri"/>
           <w:b w:val="0"/>
           <w:i w:val="0"/>
-          <w:color w:val="1F6F8B"/>
-          <w:sz w:val="21"/>
+          <w:color w:val="1F2933"/>
+          <w:sz w:val="20"/>
         </w:rPr>
-        <w:t xml:space="preserve">   |   </w:t>
+        <w:tab/>
       </w:r>
       <w:r>
         <w:rPr>
@@ -750,29 +985,30 @@
           <w:b/>
           <w:i w:val="0"/>
           <w:color w:val="1F6F8B"/>
-          <w:sz w:val="21"/>
+          <w:sz w:val="20"/>
         </w:rPr>
         <w:t>Apr 2016 – Jan 2024</w:t>
       </w:r>
     </w:p>
     <w:p>
       <w:pPr>
-        <w:spacing w:before="0" w:after="40" w:line="240" w:lineRule="auto"/>
+        <w:spacing w:before="20" w:after="20" w:line="240" w:lineRule="auto"/>
+        <w:ind w:left="68"/>
       </w:pPr>
       <w:r>
         <w:rPr>
           <w:rFonts w:ascii="Calibri" w:hAnsi="Calibri" w:eastAsia="Calibri"/>
           <w:b w:val="0"/>
           <w:i/>
-          <w:color w:val="3D4A57"/>
-          <w:sz w:val="21"/>
+          <w:color w:val="4A5866"/>
+          <w:sz w:val="20"/>
         </w:rPr>
         <w:t>Sai Agrotel, Pune  ·  progressed from Senior Firmware Engineer</w:t>
       </w:r>
     </w:p>
     <w:p>
       <w:pPr>
-        <w:spacing w:before="0" w:after="40" w:line="252" w:lineRule="auto"/>
+        <w:spacing w:before="20" w:after="20" w:line="254" w:lineRule="auto"/>
       </w:pPr>
       <w:r>
         <w:rPr>
@@ -787,8 +1023,8 @@
     </w:p>
     <w:p>
       <w:pPr>
-        <w:spacing w:before="0" w:after="16" w:line="245" w:lineRule="auto"/>
-        <w:ind w:left="198" w:hanging="198"/>
+        <w:spacing w:before="8" w:after="20" w:line="250" w:lineRule="auto"/>
+        <w:ind w:left="215" w:hanging="215"/>
       </w:pPr>
       <w:r>
         <w:rPr>
@@ -796,9 +1032,9 @@
           <w:b/>
           <w:i w:val="0"/>
           <w:color w:val="1F6F8B"/>
-          <w:sz w:val="21"/>
+          <w:sz w:val="20"/>
         </w:rPr>
-        <w:t xml:space="preserve">•  </w:t>
+        <w:t xml:space="preserve">▸  </w:t>
       </w:r>
       <w:r>
         <w:rPr>
@@ -808,13 +1044,33 @@
           <w:color w:val="1F2933"/>
           <w:sz w:val="21"/>
         </w:rPr>
-        <w:t>Led a team of 7 software, electrical, and mechanical engineers through stage-gate new-product development, using Design for Six Sigma from concept to product release.</w:t>
+        <w:t xml:space="preserve">Led a team of </w:t>
+      </w:r>
+      <w:r>
+        <w:rPr>
+          <w:rFonts w:ascii="Calibri" w:hAnsi="Calibri" w:eastAsia="Calibri"/>
+          <w:b/>
+          <w:i w:val="0"/>
+          <w:color w:val="1B3A4B"/>
+          <w:sz w:val="21"/>
+        </w:rPr>
+        <w:t>7</w:t>
+      </w:r>
+      <w:r>
+        <w:rPr>
+          <w:rFonts w:ascii="Calibri" w:hAnsi="Calibri" w:eastAsia="Calibri"/>
+          <w:b w:val="0"/>
+          <w:i w:val="0"/>
+          <w:color w:val="1F2933"/>
+          <w:sz w:val="21"/>
+        </w:rPr>
+        <w:t xml:space="preserve"> software, electrical, and mechanical engineers through stage-gate new-product development, using Design for Six Sigma from concept to product release.</w:t>
       </w:r>
     </w:p>
     <w:p>
       <w:pPr>
-        <w:spacing w:before="0" w:after="16" w:line="245" w:lineRule="auto"/>
-        <w:ind w:left="198" w:hanging="198"/>
+        <w:spacing w:before="8" w:after="20" w:line="250" w:lineRule="auto"/>
+        <w:ind w:left="215" w:hanging="215"/>
       </w:pPr>
       <w:r>
         <w:rPr>
@@ -822,9 +1078,9 @@
           <w:b/>
           <w:i w:val="0"/>
           <w:color w:val="1F6F8B"/>
-          <w:sz w:val="21"/>
+          <w:sz w:val="20"/>
         </w:rPr>
-        <w:t xml:space="preserve">•  </w:t>
+        <w:t xml:space="preserve">▸  </w:t>
       </w:r>
       <w:r>
         <w:rPr>
@@ -839,8 +1095,8 @@
     </w:p>
     <w:p>
       <w:pPr>
-        <w:spacing w:before="0" w:after="16" w:line="245" w:lineRule="auto"/>
-        <w:ind w:left="198" w:hanging="198"/>
+        <w:spacing w:before="8" w:after="20" w:line="250" w:lineRule="auto"/>
+        <w:ind w:left="215" w:hanging="215"/>
       </w:pPr>
       <w:r>
         <w:rPr>
@@ -848,9 +1104,9 @@
           <w:b/>
           <w:i w:val="0"/>
           <w:color w:val="1F6F8B"/>
-          <w:sz w:val="21"/>
+          <w:sz w:val="20"/>
         </w:rPr>
-        <w:t xml:space="preserve">•  </w:t>
+        <w:t xml:space="preserve">▸  </w:t>
       </w:r>
       <w:r>
         <w:rPr>
@@ -865,8 +1121,8 @@
     </w:p>
     <w:p>
       <w:pPr>
-        <w:spacing w:before="0" w:after="16" w:line="245" w:lineRule="auto"/>
-        <w:ind w:left="198" w:hanging="198"/>
+        <w:spacing w:before="8" w:after="20" w:line="250" w:lineRule="auto"/>
+        <w:ind w:left="215" w:hanging="215"/>
       </w:pPr>
       <w:r>
         <w:rPr>
@@ -874,9 +1130,9 @@
           <w:b/>
           <w:i w:val="0"/>
           <w:color w:val="1F6F8B"/>
-          <w:sz w:val="21"/>
+          <w:sz w:val="20"/>
         </w:rPr>
-        <w:t xml:space="preserve">•  </w:t>
+        <w:t xml:space="preserve">▸  </w:t>
       </w:r>
       <w:r>
         <w:rPr>
@@ -891,8 +1147,8 @@
     </w:p>
     <w:p>
       <w:pPr>
-        <w:spacing w:before="0" w:after="16" w:line="245" w:lineRule="auto"/>
-        <w:ind w:left="198" w:hanging="198"/>
+        <w:spacing w:before="8" w:after="20" w:line="250" w:lineRule="auto"/>
+        <w:ind w:left="215" w:hanging="215"/>
       </w:pPr>
       <w:r>
         <w:rPr>
@@ -900,9 +1156,9 @@
           <w:b/>
           <w:i w:val="0"/>
           <w:color w:val="1F6F8B"/>
-          <w:sz w:val="21"/>
+          <w:sz w:val="20"/>
         </w:rPr>
-        <w:t xml:space="preserve">•  </w:t>
+        <w:t xml:space="preserve">▸  </w:t>
       </w:r>
       <w:r>
         <w:rPr>
@@ -917,8 +1173,8 @@
     </w:p>
     <w:p>
       <w:pPr>
-        <w:spacing w:before="0" w:after="16" w:line="245" w:lineRule="auto"/>
-        <w:ind w:left="198" w:hanging="198"/>
+        <w:spacing w:before="8" w:after="20" w:line="250" w:lineRule="auto"/>
+        <w:ind w:left="215" w:hanging="215"/>
       </w:pPr>
       <w:r>
         <w:rPr>
@@ -926,9 +1182,9 @@
           <w:b/>
           <w:i w:val="0"/>
           <w:color w:val="1F6F8B"/>
-          <w:sz w:val="21"/>
+          <w:sz w:val="20"/>
         </w:rPr>
-        <w:t xml:space="preserve">•  </w:t>
+        <w:t xml:space="preserve">▸  </w:t>
       </w:r>
       <w:r>
         <w:rPr>
@@ -943,7 +1199,15 @@
     </w:p>
     <w:p>
       <w:pPr>
-        <w:spacing w:before="100" w:after="0" w:line="240" w:lineRule="auto"/>
+        <w:tabs>
+          <w:tab w:pos="10346" w:val="right"/>
+        </w:tabs>
+        <w:spacing w:before="140" w:after="0" w:line="240" w:lineRule="auto"/>
+        <w:ind w:left="68" w:right="28"/>
+        <w:shd w:val="clear" w:color="auto" w:fill="E7F2F5"/>
+        <w:pBdr>
+          <w:left w:val="single" w:sz="20" w:space="5" w:color="1B3A4B"/>
+        </w:pBdr>
       </w:pPr>
       <w:r>
         <w:rPr>
@@ -951,7 +1215,7 @@
           <w:b/>
           <w:i w:val="0"/>
           <w:color w:val="1B3A4B"/>
-          <w:sz w:val="23"/>
+          <w:sz w:val="22"/>
         </w:rPr>
         <w:t>Head of Research and Development</w:t>
       </w:r>
@@ -960,10 +1224,10 @@
           <w:rFonts w:ascii="Calibri" w:hAnsi="Calibri" w:eastAsia="Calibri"/>
           <w:b w:val="0"/>
           <w:i w:val="0"/>
-          <w:color w:val="1F6F8B"/>
-          <w:sz w:val="21"/>
+          <w:color w:val="1F2933"/>
+          <w:sz w:val="20"/>
         </w:rPr>
-        <w:t xml:space="preserve">   |   </w:t>
+        <w:tab/>
       </w:r>
       <w:r>
         <w:rPr>
@@ -971,30 +1235,31 @@
           <w:b/>
           <w:i w:val="0"/>
           <w:color w:val="1F6F8B"/>
-          <w:sz w:val="21"/>
+          <w:sz w:val="20"/>
         </w:rPr>
         <w:t>Aug 2012 – Apr 2016</w:t>
       </w:r>
     </w:p>
     <w:p>
       <w:pPr>
-        <w:spacing w:before="0" w:after="40" w:line="240" w:lineRule="auto"/>
+        <w:spacing w:before="20" w:after="20" w:line="240" w:lineRule="auto"/>
+        <w:ind w:left="68"/>
       </w:pPr>
       <w:r>
         <w:rPr>
           <w:rFonts w:ascii="Calibri" w:hAnsi="Calibri" w:eastAsia="Calibri"/>
           <w:b w:val="0"/>
           <w:i/>
-          <w:color w:val="3D4A57"/>
-          <w:sz w:val="21"/>
+          <w:color w:val="4A5866"/>
+          <w:sz w:val="20"/>
         </w:rPr>
         <w:t>Precise Technology, Pune</w:t>
       </w:r>
     </w:p>
     <w:p>
       <w:pPr>
-        <w:spacing w:before="0" w:after="16" w:line="245" w:lineRule="auto"/>
-        <w:ind w:left="198" w:hanging="198"/>
+        <w:spacing w:before="8" w:after="20" w:line="250" w:lineRule="auto"/>
+        <w:ind w:left="215" w:hanging="215"/>
       </w:pPr>
       <w:r>
         <w:rPr>
@@ -1002,9 +1267,9 @@
           <w:b/>
           <w:i w:val="0"/>
           <w:color w:val="1F6F8B"/>
-          <w:sz w:val="21"/>
+          <w:sz w:val="20"/>
         </w:rPr>
-        <w:t xml:space="preserve">•  </w:t>
+        <w:t xml:space="preserve">▸  </w:t>
       </w:r>
       <w:r>
         <w:rPr>
@@ -1019,8 +1284,8 @@
     </w:p>
     <w:p>
       <w:pPr>
-        <w:spacing w:before="0" w:after="16" w:line="245" w:lineRule="auto"/>
-        <w:ind w:left="198" w:hanging="198"/>
+        <w:spacing w:before="8" w:after="20" w:line="250" w:lineRule="auto"/>
+        <w:ind w:left="215" w:hanging="215"/>
       </w:pPr>
       <w:r>
         <w:rPr>
@@ -1028,9 +1293,9 @@
           <w:b/>
           <w:i w:val="0"/>
           <w:color w:val="1F6F8B"/>
-          <w:sz w:val="21"/>
+          <w:sz w:val="20"/>
         </w:rPr>
-        <w:t xml:space="preserve">•  </w:t>
+        <w:t xml:space="preserve">▸  </w:t>
       </w:r>
       <w:r>
         <w:rPr>
@@ -1045,8 +1310,8 @@
     </w:p>
     <w:p>
       <w:pPr>
-        <w:spacing w:before="0" w:after="16" w:line="245" w:lineRule="auto"/>
-        <w:ind w:left="198" w:hanging="198"/>
+        <w:spacing w:before="8" w:after="20" w:line="250" w:lineRule="auto"/>
+        <w:ind w:left="215" w:hanging="215"/>
       </w:pPr>
       <w:r>
         <w:rPr>
@@ -1054,9 +1319,9 @@
           <w:b/>
           <w:i w:val="0"/>
           <w:color w:val="1F6F8B"/>
-          <w:sz w:val="21"/>
+          <w:sz w:val="20"/>
         </w:rPr>
-        <w:t xml:space="preserve">•  </w:t>
+        <w:t xml:space="preserve">▸  </w:t>
       </w:r>
       <w:r>
         <w:rPr>
@@ -1071,7 +1336,15 @@
     </w:p>
     <w:p>
       <w:pPr>
-        <w:spacing w:before="100" w:after="0" w:line="240" w:lineRule="auto"/>
+        <w:tabs>
+          <w:tab w:pos="10346" w:val="right"/>
+        </w:tabs>
+        <w:spacing w:before="140" w:after="0" w:line="240" w:lineRule="auto"/>
+        <w:ind w:left="68" w:right="28"/>
+        <w:shd w:val="clear" w:color="auto" w:fill="E7F2F5"/>
+        <w:pBdr>
+          <w:left w:val="single" w:sz="20" w:space="5" w:color="1B3A4B"/>
+        </w:pBdr>
       </w:pPr>
       <w:r>
         <w:rPr>
@@ -1079,7 +1352,7 @@
           <w:b/>
           <w:i w:val="0"/>
           <w:color w:val="1B3A4B"/>
-          <w:sz w:val="23"/>
+          <w:sz w:val="22"/>
         </w:rPr>
         <w:t>Senior R&amp;D Engineer</w:t>
       </w:r>
@@ -1088,10 +1361,10 @@
           <w:rFonts w:ascii="Calibri" w:hAnsi="Calibri" w:eastAsia="Calibri"/>
           <w:b w:val="0"/>
           <w:i w:val="0"/>
-          <w:color w:val="1F6F8B"/>
-          <w:sz w:val="21"/>
+          <w:color w:val="1F2933"/>
+          <w:sz w:val="20"/>
         </w:rPr>
-        <w:t xml:space="preserve">   |   </w:t>
+        <w:tab/>
       </w:r>
       <w:r>
         <w:rPr>
@@ -1099,30 +1372,31 @@
           <w:b/>
           <w:i w:val="0"/>
           <w:color w:val="1F6F8B"/>
-          <w:sz w:val="21"/>
+          <w:sz w:val="20"/>
         </w:rPr>
         <w:t>May 2008 – Jul 2012</w:t>
       </w:r>
     </w:p>
     <w:p>
       <w:pPr>
-        <w:spacing w:before="0" w:after="40" w:line="240" w:lineRule="auto"/>
+        <w:spacing w:before="20" w:after="20" w:line="240" w:lineRule="auto"/>
+        <w:ind w:left="68"/>
       </w:pPr>
       <w:r>
         <w:rPr>
           <w:rFonts w:ascii="Calibri" w:hAnsi="Calibri" w:eastAsia="Calibri"/>
           <w:b w:val="0"/>
           <w:i/>
-          <w:color w:val="3D4A57"/>
-          <w:sz w:val="21"/>
+          <w:color w:val="4A5866"/>
+          <w:sz w:val="20"/>
         </w:rPr>
         <w:t>NESD Labs / Nexus Embedded, Pune</w:t>
       </w:r>
     </w:p>
     <w:p>
       <w:pPr>
-        <w:spacing w:before="0" w:after="16" w:line="245" w:lineRule="auto"/>
-        <w:ind w:left="198" w:hanging="198"/>
+        <w:spacing w:before="8" w:after="20" w:line="250" w:lineRule="auto"/>
+        <w:ind w:left="215" w:hanging="215"/>
       </w:pPr>
       <w:r>
         <w:rPr>
@@ -1130,9 +1404,9 @@
           <w:b/>
           <w:i w:val="0"/>
           <w:color w:val="1F6F8B"/>
-          <w:sz w:val="21"/>
+          <w:sz w:val="20"/>
         </w:rPr>
-        <w:t xml:space="preserve">•  </w:t>
+        <w:t xml:space="preserve">▸  </w:t>
       </w:r>
       <w:r>
         <w:rPr>
@@ -1147,7 +1421,15 @@
     </w:p>
     <w:p>
       <w:pPr>
-        <w:spacing w:before="100" w:after="0" w:line="240" w:lineRule="auto"/>
+        <w:tabs>
+          <w:tab w:pos="10346" w:val="right"/>
+        </w:tabs>
+        <w:spacing w:before="140" w:after="0" w:line="240" w:lineRule="auto"/>
+        <w:ind w:left="68" w:right="28"/>
+        <w:shd w:val="clear" w:color="auto" w:fill="E7F2F5"/>
+        <w:pBdr>
+          <w:left w:val="single" w:sz="20" w:space="5" w:color="1B3A4B"/>
+        </w:pBdr>
       </w:pPr>
       <w:r>
         <w:rPr>
@@ -1155,7 +1437,7 @@
           <w:b/>
           <w:i w:val="0"/>
           <w:color w:val="1B3A4B"/>
-          <w:sz w:val="23"/>
+          <w:sz w:val="22"/>
         </w:rPr>
         <w:t>R&amp;D Engineer</w:t>
       </w:r>
@@ -1164,10 +1446,10 @@
           <w:rFonts w:ascii="Calibri" w:hAnsi="Calibri" w:eastAsia="Calibri"/>
           <w:b w:val="0"/>
           <w:i w:val="0"/>
-          <w:color w:val="1F6F8B"/>
-          <w:sz w:val="21"/>
+          <w:color w:val="1F2933"/>
+          <w:sz w:val="20"/>
         </w:rPr>
-        <w:t xml:space="preserve">   |   </w:t>
+        <w:tab/>
       </w:r>
       <w:r>
         <w:rPr>
@@ -1175,30 +1457,31 @@
           <w:b/>
           <w:i w:val="0"/>
           <w:color w:val="1F6F8B"/>
-          <w:sz w:val="21"/>
+          <w:sz w:val="20"/>
         </w:rPr>
         <w:t>Mar 2007 – Apr 2008</w:t>
       </w:r>
     </w:p>
     <w:p>
       <w:pPr>
-        <w:spacing w:before="0" w:after="40" w:line="240" w:lineRule="auto"/>
+        <w:spacing w:before="20" w:after="20" w:line="240" w:lineRule="auto"/>
+        <w:ind w:left="68"/>
       </w:pPr>
       <w:r>
         <w:rPr>
           <w:rFonts w:ascii="Calibri" w:hAnsi="Calibri" w:eastAsia="Calibri"/>
           <w:b w:val="0"/>
           <w:i/>
-          <w:color w:val="3D4A57"/>
-          <w:sz w:val="21"/>
+          <w:color w:val="4A5866"/>
+          <w:sz w:val="20"/>
         </w:rPr>
         <w:t>Transworld Compressor Technologies, Pune</w:t>
       </w:r>
     </w:p>
     <w:p>
       <w:pPr>
-        <w:spacing w:before="0" w:after="16" w:line="245" w:lineRule="auto"/>
-        <w:ind w:left="198" w:hanging="198"/>
+        <w:spacing w:before="8" w:after="20" w:line="250" w:lineRule="auto"/>
+        <w:ind w:left="215" w:hanging="215"/>
       </w:pPr>
       <w:r>
         <w:rPr>
@@ -1206,9 +1489,9 @@
           <w:b/>
           <w:i w:val="0"/>
           <w:color w:val="1F6F8B"/>
-          <w:sz w:val="21"/>
+          <w:sz w:val="20"/>
         </w:rPr>
-        <w:t xml:space="preserve">•  </w:t>
+        <w:t xml:space="preserve">▸  </w:t>
       </w:r>
       <w:r>
         <w:rPr>
@@ -1223,9 +1506,9 @@
     </w:p>
     <w:p>
       <w:pPr>
-        <w:spacing w:before="120" w:after="40" w:line="240" w:lineRule="auto"/>
+        <w:spacing w:before="160" w:after="40" w:line="240" w:lineRule="auto"/>
         <w:pBdr>
-          <w:bottom w:val="single" w:sz="8" w:space="1" w:color="1F6F8B"/>
+          <w:bottom w:val="single" w:sz="12" w:space="1" w:color="1B3A4B"/>
         </w:pBdr>
       </w:pPr>
       <w:r>
@@ -1234,7 +1517,7 @@
           <w:b/>
           <w:i w:val="0"/>
           <w:color w:val="1B3A4B"/>
-          <w:sz w:val="23"/>
+          <w:sz w:val="22"/>
         </w:rPr>
         <w:t>EDUCATION</w:t>
       </w:r>
@@ -1248,7 +1531,7 @@
           <w:rFonts w:ascii="Calibri" w:hAnsi="Calibri" w:eastAsia="Calibri"/>
           <w:b/>
           <w:i w:val="0"/>
-          <w:color w:val="1F2933"/>
+          <w:color w:val="1B3A4B"/>
           <w:sz w:val="21"/>
         </w:rPr>
         <w:t>Bachelor of Engineering, Electronics and Telecommunication</w:t>
@@ -1290,13 +1573,49 @@
       </w:r>
     </w:p>
     <w:sectPr>
+      <w:footerReference w:type="default" r:id="rId10"/>
       <w:pgSz w:w="11906" w:h="16838"/>
-      <w:pgMar w:top="595" w:right="794" w:bottom="539" w:left="794" w:header="720" w:footer="720" w:gutter="0"/>
+      <w:pgMar w:top="595" w:right="737" w:bottom="652" w:left="737" w:header="227" w:footer="198" w:gutter="0"/>
       <w:cols w:space="720"/>
       <w:docGrid w:linePitch="360"/>
     </w:sectPr>
   </w:body>
 </w:document>
+</file>
+
+<file path=word/footer1.xml><?xml version="1.0" encoding="utf-8"?>
+<w:ftr xmlns:m="http://schemas.openxmlformats.org/officeDocument/2006/math" xmlns:mc="http://schemas.openxmlformats.org/markup-compatibility/2006" xmlns:mo="http://schemas.microsoft.com/office/mac/office/2008/main" xmlns:mv="urn:schemas-microsoft-com:mac:vml" xmlns:o="urn:schemas-microsoft-com:office:office" xmlns:r="http://schemas.openxmlformats.org/officeDocument/2006/relationships" xmlns:v="urn:schemas-microsoft-com:vml" xmlns:w10="urn:schemas-microsoft-com:office:word" xmlns:w14="http://schemas.microsoft.com/office/word/2010/wordml" xmlns:w="http://schemas.openxmlformats.org/wordprocessingml/2006/main" xmlns:wne="http://schemas.microsoft.com/office/word/2006/wordml" xmlns:wp14="http://schemas.microsoft.com/office/word/2010/wordprocessingDrawing" xmlns:wp="http://schemas.openxmlformats.org/drawingml/2006/wordprocessingDrawing" xmlns:wpc="http://schemas.microsoft.com/office/word/2010/wordprocessingCanvas" xmlns:wpg="http://schemas.microsoft.com/office/word/2010/wordprocessingGroup" xmlns:wpi="http://schemas.microsoft.com/office/word/2010/wordprocessingInk" xmlns:wps="http://schemas.microsoft.com/office/word/2010/wordprocessingShape" mc:Ignorable="w14 wp14">
+  <w:p>
+    <w:pPr>
+      <w:pStyle w:val="Footer"/>
+      <w:spacing w:before="40" w:after="0" w:line="240" w:lineRule="auto"/>
+      <w:jc w:val="center"/>
+      <w:pBdr>
+        <w:top w:val="single" w:sz="8" w:space="2" w:color="1F6F8B"/>
+      </w:pBdr>
+    </w:pPr>
+    <w:r>
+      <w:rPr>
+        <w:rFonts w:ascii="Calibri" w:hAnsi="Calibri" w:eastAsia="Calibri"/>
+        <w:b/>
+        <w:i w:val="0"/>
+        <w:color w:val="1B3A4B"/>
+        <w:sz w:val="16"/>
+      </w:rPr>
+      <w:t>Shyam Premkumar Shrivastava</w:t>
+    </w:r>
+    <w:r>
+      <w:rPr>
+        <w:rFonts w:ascii="Calibri" w:hAnsi="Calibri" w:eastAsia="Calibri"/>
+        <w:b w:val="0"/>
+        <w:i w:val="0"/>
+        <w:color w:val="4A5866"/>
+        <w:sz w:val="16"/>
+      </w:rPr>
+      <w:t xml:space="preserve">   ·   Pune   ·   Firmware Engineering Leader</w:t>
+    </w:r>
+  </w:p>
+</w:ftr>
 </file>
 
 <file path=word/numbering.xml><?xml version="1.0" encoding="utf-8"?>

</xml_diff>